<commit_message>
Several small edits of wording, figures, layout, etc.
</commit_message>
<xml_diff>
--- a/StudentGuideModule2/deriving_em_waves/faradays_law.docx
+++ b/StudentGuideModule2/deriving_em_waves/faradays_law.docx
@@ -19,17 +19,146 @@
           <w:szCs w:val="24"/>
         </w:rPr>
         <mc:AlternateContent>
+          <mc:Choice Requires="wps">
+            <w:drawing>
+              <wp:anchor distT="0" distB="0" distL="114300" distR="114300" simplePos="0" relativeHeight="251698688" behindDoc="0" locked="0" layoutInCell="1" allowOverlap="1" wp14:anchorId="31548AAB" wp14:editId="157A49CD">
+                <wp:simplePos x="0" y="0"/>
+                <wp:positionH relativeFrom="column">
+                  <wp:posOffset>705853</wp:posOffset>
+                </wp:positionH>
+                <wp:positionV relativeFrom="paragraph">
+                  <wp:posOffset>1668379</wp:posOffset>
+                </wp:positionV>
+                <wp:extent cx="222621" cy="896085"/>
+                <wp:effectExtent l="0" t="0" r="25400" b="18415"/>
+                <wp:wrapNone/>
+                <wp:docPr id="665786834" name="Freeform: Shape 56"/>
+                <wp:cNvGraphicFramePr/>
+                <a:graphic xmlns:a="http://schemas.openxmlformats.org/drawingml/2006/main">
+                  <a:graphicData uri="http://schemas.microsoft.com/office/word/2010/wordprocessingShape">
+                    <wps:wsp>
+                      <wps:cNvSpPr/>
+                      <wps:spPr>
+                        <a:xfrm>
+                          <a:off x="0" y="0"/>
+                          <a:ext cx="222621" cy="896085"/>
+                        </a:xfrm>
+                        <a:custGeom>
+                          <a:avLst/>
+                          <a:gdLst>
+                            <a:gd name="csX0" fmla="*/ 0 w 560061"/>
+                            <a:gd name="csY0" fmla="*/ 0 h 1002573"/>
+                            <a:gd name="csX1" fmla="*/ 0 w 560061"/>
+                            <a:gd name="csY1" fmla="*/ 453887 h 1002573"/>
+                            <a:gd name="csX2" fmla="*/ 553278 w 560061"/>
+                            <a:gd name="csY2" fmla="*/ 453887 h 1002573"/>
+                            <a:gd name="csX3" fmla="*/ 559968 w 560061"/>
+                            <a:gd name="csY3" fmla="*/ 1002573 h 1002573"/>
+                          </a:gdLst>
+                          <a:ahLst/>
+                          <a:cxnLst>
+                            <a:cxn ang="0">
+                              <a:pos x="csX0" y="csY0"/>
+                            </a:cxn>
+                            <a:cxn ang="0">
+                              <a:pos x="csX1" y="csY1"/>
+                            </a:cxn>
+                            <a:cxn ang="0">
+                              <a:pos x="csX2" y="csY2"/>
+                            </a:cxn>
+                            <a:cxn ang="0">
+                              <a:pos x="csX3" y="csY3"/>
+                            </a:cxn>
+                          </a:cxnLst>
+                          <a:rect l="l" t="t" r="r" b="b"/>
+                          <a:pathLst>
+                            <a:path w="560061" h="1002573">
+                              <a:moveTo>
+                                <a:pt x="0" y="0"/>
+                              </a:moveTo>
+                              <a:lnTo>
+                                <a:pt x="0" y="453887"/>
+                              </a:lnTo>
+                              <a:lnTo>
+                                <a:pt x="553278" y="453887"/>
+                              </a:lnTo>
+                              <a:cubicBezTo>
+                                <a:pt x="552181" y="577412"/>
+                                <a:pt x="561065" y="879048"/>
+                                <a:pt x="559968" y="1002573"/>
+                              </a:cubicBezTo>
+                            </a:path>
+                          </a:pathLst>
+                        </a:custGeom>
+                        <a:noFill/>
+                        <a:ln w="19050">
+                          <a:solidFill>
+                            <a:schemeClr val="tx1"/>
+                          </a:solidFill>
+                        </a:ln>
+                      </wps:spPr>
+                      <wps:style>
+                        <a:lnRef idx="2">
+                          <a:schemeClr val="accent1">
+                            <a:shade val="15000"/>
+                          </a:schemeClr>
+                        </a:lnRef>
+                        <a:fillRef idx="1">
+                          <a:schemeClr val="accent1"/>
+                        </a:fillRef>
+                        <a:effectRef idx="0">
+                          <a:schemeClr val="accent1"/>
+                        </a:effectRef>
+                        <a:fontRef idx="minor">
+                          <a:schemeClr val="lt1"/>
+                        </a:fontRef>
+                      </wps:style>
+                      <wps:bodyPr rot="0" spcFirstLastPara="0" vertOverflow="overflow" horzOverflow="overflow" vert="horz" wrap="square" lIns="91440" tIns="45720" rIns="91440" bIns="45720" numCol="1" spcCol="0" rtlCol="0" fromWordArt="0" anchor="ctr" anchorCtr="0" forceAA="0" compatLnSpc="1">
+                        <a:prstTxWarp prst="textNoShape">
+                          <a:avLst/>
+                        </a:prstTxWarp>
+                        <a:noAutofit/>
+                      </wps:bodyPr>
+                    </wps:wsp>
+                  </a:graphicData>
+                </a:graphic>
+                <wp14:sizeRelH relativeFrom="margin">
+                  <wp14:pctWidth>0</wp14:pctWidth>
+                </wp14:sizeRelH>
+                <wp14:sizeRelV relativeFrom="margin">
+                  <wp14:pctHeight>0</wp14:pctHeight>
+                </wp14:sizeRelV>
+              </wp:anchor>
+            </w:drawing>
+          </mc:Choice>
+          <mc:Fallback>
+            <w:pict>
+              <v:shape w14:anchorId="32B0589A" id="Freeform: Shape 56" o:spid="_x0000_s1026" style="position:absolute;margin-left:55.6pt;margin-top:131.35pt;width:17.55pt;height:70.55pt;z-index:251698688;visibility:visible;mso-wrap-style:square;mso-width-percent:0;mso-height-percent:0;mso-wrap-distance-left:9pt;mso-wrap-distance-top:0;mso-wrap-distance-right:9pt;mso-wrap-distance-bottom:0;mso-position-horizontal:absolute;mso-position-horizontal-relative:text;mso-position-vertical:absolute;mso-position-vertical-relative:text;mso-width-percent:0;mso-height-percent:0;mso-width-relative:margin;mso-height-relative:margin;v-text-anchor:middle" coordsize="560061,1002573" o:gfxdata="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" path="m,l,453887r553278,c552181,577412,561065,879048,559968,1002573e" filled="f" strokecolor="black [3213]" strokeweight="1.5pt">
+                <v:path arrowok="t" o:connecttype="custom" o:connectlocs="0,0;0,405678;219925,405678;222584,896085" o:connectangles="0,0,0,0"/>
+              </v:shape>
+            </w:pict>
+          </mc:Fallback>
+        </mc:AlternateContent>
+      </w:r>
+      <w:r>
+        <w:rPr>
+          <w:rFonts w:ascii="Times New Roman" w:hAnsi="Times New Roman" w:cs="Times New Roman"/>
+          <w:noProof/>
+          <w:sz w:val="24"/>
+          <w:szCs w:val="24"/>
+        </w:rPr>
+        <mc:AlternateContent>
           <mc:Choice Requires="wpg">
             <w:drawing>
-              <wp:anchor distT="0" distB="0" distL="114300" distR="114300" simplePos="0" relativeHeight="251496960" behindDoc="0" locked="0" layoutInCell="1" allowOverlap="1" wp14:anchorId="4833EC7A" wp14:editId="65F7C2A8">
+              <wp:anchor distT="0" distB="0" distL="114300" distR="114300" simplePos="0" relativeHeight="251620864" behindDoc="0" locked="0" layoutInCell="1" allowOverlap="1" wp14:anchorId="4833EC7A" wp14:editId="58934BEE">
                 <wp:simplePos x="0" y="0"/>
                 <wp:positionH relativeFrom="column">
-                  <wp:posOffset>124300</wp:posOffset>
+                  <wp:posOffset>123324</wp:posOffset>
                 </wp:positionH>
                 <wp:positionV relativeFrom="paragraph">
-                  <wp:posOffset>1999011</wp:posOffset>
+                  <wp:posOffset>1999247</wp:posOffset>
                 </wp:positionV>
-                <wp:extent cx="1179084" cy="799310"/>
+                <wp:extent cx="1178560" cy="798830"/>
                 <wp:effectExtent l="95250" t="0" r="21590" b="1270"/>
                 <wp:wrapNone/>
                 <wp:docPr id="1258520223" name="current supply"/>
@@ -41,7 +170,7 @@
                       <wpg:grpSpPr>
                         <a:xfrm>
                           <a:off x="0" y="0"/>
-                          <a:ext cx="1179084" cy="799310"/>
+                          <a:ext cx="1178560" cy="798830"/>
                           <a:chOff x="-101409" y="-148854"/>
                           <a:chExt cx="1179172" cy="799755"/>
                         </a:xfrm>
@@ -768,7 +897,7 @@
                         <wps:cNvSpPr/>
                         <wps:spPr>
                           <a:xfrm>
-                            <a:off x="778565" y="256761"/>
+                            <a:off x="808659" y="435437"/>
                             <a:ext cx="78316" cy="78316"/>
                           </a:xfrm>
                           <a:prstGeom prst="ellipse">
@@ -809,7 +938,7 @@
                         <wps:cNvSpPr/>
                         <wps:spPr>
                           <a:xfrm>
-                            <a:off x="780222" y="420756"/>
+                            <a:off x="661896" y="432795"/>
                             <a:ext cx="78316" cy="78316"/>
                           </a:xfrm>
                           <a:prstGeom prst="ellipse">
@@ -859,7 +988,7 @@
           </mc:Choice>
           <mc:Fallback>
             <w:pict>
-              <v:group w14:anchorId="4833EC7A" id="current supply" o:spid="_x0000_s1026" style="position:absolute;margin-left:9.8pt;margin-top:157.4pt;width:92.85pt;height:62.95pt;z-index:251496960;mso-width-relative:margin;mso-height-relative:margin" coordorigin="-1014,-1488" coordsize="11791,7997" o:gfxdata="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">
+              <v:group w14:anchorId="4833EC7A" id="current supply" o:spid="_x0000_s1026" style="position:absolute;margin-left:9.7pt;margin-top:157.4pt;width:92.8pt;height:62.9pt;z-index:251620864;mso-width-relative:margin;mso-height-relative:margin" coordorigin="-1014,-1488" coordsize="11791,7997" o:gfxdata="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">
                 <v:shapetype id="_x0000_t16" coordsize="21600,21600" o:spt="16" adj="5400" path="m@0,l0@0,,21600@1,21600,21600@2,21600,xem0@0nfl@1@0,21600,em@1@0nfl@1,21600e">
                   <v:stroke joinstyle="miter"/>
                   <v:formulas>
@@ -953,8 +1082,8 @@
                 <v:shape id="hand" o:spid="_x0000_s1042" style="position:absolute;left:-914;top:-1588;width:6160;height:6359;rotation:-3193082fd;flip:x;visibility:visible;mso-wrap-style:square;v-text-anchor:middle" coordsize="575276,594327" o:gfxdata="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" path="m9599,250864v-27538,314,10201,-114815,37549,-125510c74496,114659,175605,218027,173685,186694,192357,169473,59218,67109,95046,30134,123476,9973,209536,166073,225209,161055,240882,156038,154278,1903,189085,29v34807,-1874,53029,87042,84639,136776c305334,186539,328853,239470,378746,298434v64778,64052,178845,143014,194335,192157c588571,539734,518654,603208,471689,593294,424724,583380,346385,453325,291293,431105,236201,408885,183002,468350,141138,459973,99274,451596,13452,404382,40106,380845v26654,-23537,62119,14055,83801,12760c145589,392310,162610,392702,170199,373077v7589,-19625,17835,-65324,-759,-97225c150846,243951,85035,193060,58395,188895,31755,184730,37137,250550,9599,250864xe" fillcolor="#5a5a5a [2109]" stroked="f" strokeweight="2pt">
                   <v:path arrowok="t" o:connecttype="custom" o:connectlocs="10281,268447;50496,134140;186017,199779;101795,32246;241200,172343;202511,31;293160,146394;405639,319351;613772,524976;505181,634878;311976,461321;151159,492212;42954,407538;132705,421193;182284,399226;181471,295186;62541,202135;10281,268447" o:connectangles="0,0,0,0,0,0,0,0,0,0,0,0,0,0,0,0,0,0"/>
                 </v:shape>
-                <v:oval id="Oval 50" o:spid="_x0000_s1043" style="position:absolute;left:7785;top:2567;width:783;height:783;visibility:visible;mso-wrap-style:square;v-text-anchor:middle" o:gfxdata="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" filled="f" strokecolor="red" strokeweight="1.5pt"/>
-                <v:oval id="Oval 50" o:spid="_x0000_s1044" style="position:absolute;left:7802;top:4207;width:783;height:783;visibility:visible;mso-wrap-style:square;v-text-anchor:middle" o:gfxdata="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" filled="f" strokecolor="black [3213]" strokeweight="1.5pt"/>
+                <v:oval id="Oval 50" o:spid="_x0000_s1043" style="position:absolute;left:8086;top:4354;width:783;height:783;visibility:visible;mso-wrap-style:square;v-text-anchor:middle" o:gfxdata="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" filled="f" strokecolor="red" strokeweight="1.5pt"/>
+                <v:oval id="Oval 50" o:spid="_x0000_s1044" style="position:absolute;left:6618;top:4327;width:784;height:784;visibility:visible;mso-wrap-style:square;v-text-anchor:middle" o:gfxdata="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" filled="f" strokecolor="black [3213]" strokeweight="1.5pt"/>
               </v:group>
             </w:pict>
           </mc:Fallback>
@@ -967,13 +1096,13 @@
         <mc:AlternateContent>
           <mc:Choice Requires="wps">
             <w:drawing>
-              <wp:anchor distT="0" distB="0" distL="114300" distR="114300" simplePos="0" relativeHeight="251636224" behindDoc="0" locked="0" layoutInCell="1" allowOverlap="1" wp14:anchorId="08FD0E29" wp14:editId="7019B59C">
+              <wp:anchor distT="0" distB="0" distL="114300" distR="114300" simplePos="0" relativeHeight="251630080" behindDoc="0" locked="0" layoutInCell="1" allowOverlap="1" wp14:anchorId="08FD0E29" wp14:editId="2CDC080C">
                 <wp:simplePos x="0" y="0"/>
                 <wp:positionH relativeFrom="column">
-                  <wp:posOffset>1315085</wp:posOffset>
+                  <wp:posOffset>1441383</wp:posOffset>
                 </wp:positionH>
                 <wp:positionV relativeFrom="paragraph">
-                  <wp:posOffset>2387600</wp:posOffset>
+                  <wp:posOffset>2373496</wp:posOffset>
                 </wp:positionV>
                 <wp:extent cx="457200" cy="327660"/>
                 <wp:effectExtent l="0" t="0" r="0" b="0"/>
@@ -1044,7 +1173,7 @@
           </mc:Choice>
           <mc:Fallback>
             <w:pict>
-              <v:shape w14:anchorId="08FD0E29" id="L Text Box 32" o:spid="_x0000_s1045" type="#_x0000_t202" style="position:absolute;margin-left:103.55pt;margin-top:188pt;width:36pt;height:25.8pt;z-index:251636224;visibility:visible;mso-wrap-style:square;mso-wrap-distance-left:9pt;mso-wrap-distance-top:0;mso-wrap-distance-right:9pt;mso-wrap-distance-bottom:0;mso-position-horizontal:absolute;mso-position-horizontal-relative:text;mso-position-vertical:absolute;mso-position-vertical-relative:text;v-text-anchor:top" o:gfxdata="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" filled="f" stroked="f" strokeweight=".5pt">
+              <v:shape w14:anchorId="08FD0E29" id="L Text Box 32" o:spid="_x0000_s1045" type="#_x0000_t202" style="position:absolute;margin-left:113.5pt;margin-top:186.9pt;width:36pt;height:25.8pt;z-index:251630080;visibility:visible;mso-wrap-style:square;mso-wrap-distance-left:9pt;mso-wrap-distance-top:0;mso-wrap-distance-right:9pt;mso-wrap-distance-bottom:0;mso-position-horizontal:absolute;mso-position-horizontal-relative:text;mso-position-vertical:absolute;mso-position-vertical-relative:text;v-text-anchor:top" o:gfxdata="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" filled="f" stroked="f" strokeweight=".5pt">
                 <v:textbox>
                   <w:txbxContent>
                     <w:p>
@@ -1090,18 +1219,18 @@
         <mc:AlternateContent>
           <mc:Choice Requires="wps">
             <w:drawing>
-              <wp:anchor distT="0" distB="0" distL="114300" distR="114300" simplePos="0" relativeHeight="251723264" behindDoc="0" locked="0" layoutInCell="1" allowOverlap="1" wp14:anchorId="1BF067C7" wp14:editId="27B544B6">
+              <wp:anchor distT="0" distB="0" distL="114300" distR="114300" simplePos="0" relativeHeight="251662848" behindDoc="0" locked="0" layoutInCell="1" allowOverlap="1" wp14:anchorId="04A88447" wp14:editId="020D4469">
                 <wp:simplePos x="0" y="0"/>
                 <wp:positionH relativeFrom="column">
-                  <wp:posOffset>1365250</wp:posOffset>
+                  <wp:posOffset>1463040</wp:posOffset>
                 </wp:positionH>
                 <wp:positionV relativeFrom="paragraph">
-                  <wp:posOffset>2698750</wp:posOffset>
+                  <wp:posOffset>2393315</wp:posOffset>
                 </wp:positionV>
                 <wp:extent cx="365760" cy="0"/>
                 <wp:effectExtent l="0" t="76200" r="0" b="95250"/>
                 <wp:wrapNone/>
-                <wp:docPr id="78190102" name="left I arrow"/>
+                <wp:docPr id="1672242201" name="left I arrow"/>
                 <wp:cNvGraphicFramePr/>
                 <a:graphic xmlns:a="http://schemas.openxmlformats.org/drawingml/2006/main">
                   <a:graphicData uri="http://schemas.microsoft.com/office/word/2010/wordprocessingShape">
@@ -1145,11 +1274,11 @@
           </mc:Choice>
           <mc:Fallback>
             <w:pict>
-              <v:shapetype w14:anchorId="2AB640E4" id="_x0000_t32" coordsize="21600,21600" o:spt="32" o:oned="t" path="m,l21600,21600e" filled="f">
+              <v:shapetype w14:anchorId="418068E7" id="_x0000_t32" coordsize="21600,21600" o:spt="32" o:oned="t" path="m,l21600,21600e" filled="f">
                 <v:path arrowok="t" fillok="f" o:connecttype="none"/>
                 <o:lock v:ext="edit" shapetype="t"/>
               </v:shapetype>
-              <v:shape id="left I arrow" o:spid="_x0000_s1026" type="#_x0000_t32" style="position:absolute;margin-left:107.5pt;margin-top:212.5pt;width:28.8pt;height:0;flip:x;z-index:251723264;visibility:visible;mso-wrap-style:square;mso-wrap-distance-left:9pt;mso-wrap-distance-top:0;mso-wrap-distance-right:9pt;mso-wrap-distance-bottom:0;mso-position-horizontal:absolute;mso-position-horizontal-relative:text;mso-position-vertical:absolute;mso-position-vertical-relative:text" o:gfxdata="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" strokecolor="black [3213]" strokeweight="1pt">
+              <v:shape id="left I arrow" o:spid="_x0000_s1026" type="#_x0000_t32" style="position:absolute;margin-left:115.2pt;margin-top:188.45pt;width:28.8pt;height:0;flip:x;z-index:251662848;visibility:visible;mso-wrap-style:square;mso-wrap-distance-left:9pt;mso-wrap-distance-top:0;mso-wrap-distance-right:9pt;mso-wrap-distance-bottom:0;mso-position-horizontal:absolute;mso-position-horizontal-relative:text;mso-position-vertical:absolute;mso-position-vertical-relative:text" o:gfxdata="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" strokecolor="black [3213]" strokeweight="1pt">
                 <v:stroke endarrow="block" endarrowlength="long"/>
               </v:shape>
             </w:pict>
@@ -1163,18 +1292,18 @@
         <mc:AlternateContent>
           <mc:Choice Requires="wps">
             <w:drawing>
-              <wp:anchor distT="0" distB="0" distL="114300" distR="114300" simplePos="0" relativeHeight="251680256" behindDoc="0" locked="0" layoutInCell="1" allowOverlap="1" wp14:anchorId="04A88447" wp14:editId="13F1361A">
+              <wp:anchor distT="0" distB="0" distL="114300" distR="114300" simplePos="0" relativeHeight="251696640" behindDoc="0" locked="0" layoutInCell="1" allowOverlap="1" wp14:anchorId="1BF067C7" wp14:editId="7FD75945">
                 <wp:simplePos x="0" y="0"/>
                 <wp:positionH relativeFrom="column">
-                  <wp:posOffset>1377510</wp:posOffset>
+                  <wp:posOffset>1561565</wp:posOffset>
                 </wp:positionH>
                 <wp:positionV relativeFrom="paragraph">
-                  <wp:posOffset>2393315</wp:posOffset>
+                  <wp:posOffset>2698750</wp:posOffset>
                 </wp:positionV>
                 <wp:extent cx="365760" cy="0"/>
                 <wp:effectExtent l="0" t="76200" r="0" b="95250"/>
                 <wp:wrapNone/>
-                <wp:docPr id="1672242201" name="left I arrow"/>
+                <wp:docPr id="78190102" name="left I arrow"/>
                 <wp:cNvGraphicFramePr/>
                 <a:graphic xmlns:a="http://schemas.openxmlformats.org/drawingml/2006/main">
                   <a:graphicData uri="http://schemas.microsoft.com/office/word/2010/wordprocessingShape">
@@ -1218,7 +1347,7 @@
           </mc:Choice>
           <mc:Fallback>
             <w:pict>
-              <v:shape w14:anchorId="3C7E620D" id="left I arrow" o:spid="_x0000_s1026" type="#_x0000_t32" style="position:absolute;margin-left:108.45pt;margin-top:188.45pt;width:28.8pt;height:0;z-index:251680256;visibility:visible;mso-wrap-style:square;mso-wrap-distance-left:9pt;mso-wrap-distance-top:0;mso-wrap-distance-right:9pt;mso-wrap-distance-bottom:0;mso-position-horizontal:absolute;mso-position-horizontal-relative:text;mso-position-vertical:absolute;mso-position-vertical-relative:text" o:gfxdata="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" strokecolor="black [3213]" strokeweight="1pt">
+              <v:shape w14:anchorId="7A0851FD" id="left I arrow" o:spid="_x0000_s1026" type="#_x0000_t32" style="position:absolute;margin-left:122.95pt;margin-top:212.5pt;width:28.8pt;height:0;z-index:251696640;visibility:visible;mso-wrap-style:square;mso-wrap-distance-left:9pt;mso-wrap-distance-top:0;mso-wrap-distance-right:9pt;mso-wrap-distance-bottom:0;mso-position-horizontal:absolute;mso-position-horizontal-relative:text;mso-position-vertical:absolute;mso-position-vertical-relative:text" o:gfxdata="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" strokecolor="black [3213]" strokeweight="1pt">
                 <v:stroke endarrow="block" endarrowlength="long"/>
               </v:shape>
             </w:pict>
@@ -1232,7 +1361,7 @@
         <mc:AlternateContent>
           <mc:Choice Requires="wps">
             <w:drawing>
-              <wp:anchor distT="0" distB="0" distL="114300" distR="114300" simplePos="0" relativeHeight="252499968" behindDoc="0" locked="0" layoutInCell="1" allowOverlap="1" wp14:anchorId="671406C7" wp14:editId="1390269A">
+              <wp:anchor distT="0" distB="0" distL="114300" distR="114300" simplePos="0" relativeHeight="251700736" behindDoc="0" locked="0" layoutInCell="1" allowOverlap="1" wp14:anchorId="671406C7" wp14:editId="00709628">
                 <wp:simplePos x="0" y="0"/>
                 <wp:positionH relativeFrom="column">
                   <wp:posOffset>1191093</wp:posOffset>
@@ -1324,7 +1453,7 @@
           </mc:Choice>
           <mc:Fallback>
             <w:pict>
-              <v:shape w14:anchorId="671406C7" id="Text Box 38" o:spid="_x0000_s1046" type="#_x0000_t202" style="position:absolute;margin-left:93.8pt;margin-top:88.85pt;width:48.65pt;height:40.8pt;z-index:252499968;visibility:visible;mso-wrap-style:square;mso-width-percent:0;mso-height-percent:0;mso-wrap-distance-left:9pt;mso-wrap-distance-top:0;mso-wrap-distance-right:9pt;mso-wrap-distance-bottom:0;mso-position-horizontal:absolute;mso-position-horizontal-relative:text;mso-position-vertical:absolute;mso-position-vertical-relative:text;mso-width-percent:0;mso-height-percent:0;mso-width-relative:margin;mso-height-relative:margin;v-text-anchor:top" o:gfxdata="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" filled="f" stroked="f" strokeweight=".5pt">
+              <v:shape w14:anchorId="671406C7" id="Text Box 38" o:spid="_x0000_s1046" type="#_x0000_t202" style="position:absolute;margin-left:93.8pt;margin-top:88.85pt;width:48.65pt;height:40.8pt;z-index:251700736;visibility:visible;mso-wrap-style:square;mso-width-percent:0;mso-height-percent:0;mso-wrap-distance-left:9pt;mso-wrap-distance-top:0;mso-wrap-distance-right:9pt;mso-wrap-distance-bottom:0;mso-position-horizontal:absolute;mso-position-horizontal-relative:text;mso-position-vertical:absolute;mso-position-vertical-relative:text;mso-width-percent:0;mso-height-percent:0;mso-width-relative:margin;mso-height-relative:margin;v-text-anchor:top" o:gfxdata="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" filled="f" stroked="f" strokeweight=".5pt">
                 <v:textbox>
                   <w:txbxContent>
                     <w:p>
@@ -1367,135 +1496,6 @@
                     </w:p>
                   </w:txbxContent>
                 </v:textbox>
-              </v:shape>
-            </w:pict>
-          </mc:Fallback>
-        </mc:AlternateContent>
-      </w:r>
-      <w:r>
-        <w:rPr>
-          <w:rFonts w:ascii="Times New Roman" w:hAnsi="Times New Roman" w:cs="Times New Roman"/>
-          <w:noProof/>
-          <w:sz w:val="24"/>
-          <w:szCs w:val="24"/>
-        </w:rPr>
-        <mc:AlternateContent>
-          <mc:Choice Requires="wps">
-            <w:drawing>
-              <wp:anchor distT="0" distB="0" distL="114300" distR="114300" simplePos="0" relativeHeight="252485120" behindDoc="0" locked="0" layoutInCell="1" allowOverlap="1" wp14:anchorId="31548AAB" wp14:editId="5C6E5DF1">
-                <wp:simplePos x="0" y="0"/>
-                <wp:positionH relativeFrom="column">
-                  <wp:posOffset>705853</wp:posOffset>
-                </wp:positionH>
-                <wp:positionV relativeFrom="paragraph">
-                  <wp:posOffset>1668379</wp:posOffset>
-                </wp:positionV>
-                <wp:extent cx="340751" cy="742025"/>
-                <wp:effectExtent l="0" t="0" r="21590" b="20320"/>
-                <wp:wrapNone/>
-                <wp:docPr id="665786834" name="Freeform: Shape 56"/>
-                <wp:cNvGraphicFramePr/>
-                <a:graphic xmlns:a="http://schemas.openxmlformats.org/drawingml/2006/main">
-                  <a:graphicData uri="http://schemas.microsoft.com/office/word/2010/wordprocessingShape">
-                    <wps:wsp>
-                      <wps:cNvSpPr/>
-                      <wps:spPr>
-                        <a:xfrm>
-                          <a:off x="0" y="0"/>
-                          <a:ext cx="340751" cy="742025"/>
-                        </a:xfrm>
-                        <a:custGeom>
-                          <a:avLst/>
-                          <a:gdLst>
-                            <a:gd name="csX0" fmla="*/ 0 w 559968"/>
-                            <a:gd name="csY0" fmla="*/ 0 h 829819"/>
-                            <a:gd name="csX1" fmla="*/ 0 w 559968"/>
-                            <a:gd name="csY1" fmla="*/ 453887 h 829819"/>
-                            <a:gd name="csX2" fmla="*/ 553278 w 559968"/>
-                            <a:gd name="csY2" fmla="*/ 453887 h 829819"/>
-                            <a:gd name="csX3" fmla="*/ 559874 w 559968"/>
-                            <a:gd name="csY3" fmla="*/ 829819 h 829819"/>
-                          </a:gdLst>
-                          <a:ahLst/>
-                          <a:cxnLst>
-                            <a:cxn ang="0">
-                              <a:pos x="csX0" y="csY0"/>
-                            </a:cxn>
-                            <a:cxn ang="0">
-                              <a:pos x="csX1" y="csY1"/>
-                            </a:cxn>
-                            <a:cxn ang="0">
-                              <a:pos x="csX2" y="csY2"/>
-                            </a:cxn>
-                            <a:cxn ang="0">
-                              <a:pos x="csX3" y="csY3"/>
-                            </a:cxn>
-                          </a:cxnLst>
-                          <a:rect l="l" t="t" r="r" b="b"/>
-                          <a:pathLst>
-                            <a:path w="559968" h="829819">
-                              <a:moveTo>
-                                <a:pt x="0" y="0"/>
-                              </a:moveTo>
-                              <a:lnTo>
-                                <a:pt x="0" y="453887"/>
-                              </a:lnTo>
-                              <a:lnTo>
-                                <a:pt x="553278" y="453887"/>
-                              </a:lnTo>
-                              <a:cubicBezTo>
-                                <a:pt x="552181" y="577412"/>
-                                <a:pt x="560971" y="706294"/>
-                                <a:pt x="559874" y="829819"/>
-                              </a:cubicBezTo>
-                            </a:path>
-                          </a:pathLst>
-                        </a:custGeom>
-                        <a:noFill/>
-                        <a:ln w="19050">
-                          <a:solidFill>
-                            <a:schemeClr val="tx1"/>
-                          </a:solidFill>
-                        </a:ln>
-                      </wps:spPr>
-                      <wps:style>
-                        <a:lnRef idx="2">
-                          <a:schemeClr val="accent1">
-                            <a:shade val="15000"/>
-                          </a:schemeClr>
-                        </a:lnRef>
-                        <a:fillRef idx="1">
-                          <a:schemeClr val="accent1"/>
-                        </a:fillRef>
-                        <a:effectRef idx="0">
-                          <a:schemeClr val="accent1"/>
-                        </a:effectRef>
-                        <a:fontRef idx="minor">
-                          <a:schemeClr val="lt1"/>
-                        </a:fontRef>
-                      </wps:style>
-                      <wps:bodyPr rot="0" spcFirstLastPara="0" vertOverflow="overflow" horzOverflow="overflow" vert="horz" wrap="square" lIns="91440" tIns="45720" rIns="91440" bIns="45720" numCol="1" spcCol="0" rtlCol="0" fromWordArt="0" anchor="ctr" anchorCtr="0" forceAA="0" compatLnSpc="1">
-                        <a:prstTxWarp prst="textNoShape">
-                          <a:avLst/>
-                        </a:prstTxWarp>
-                        <a:noAutofit/>
-                      </wps:bodyPr>
-                    </wps:wsp>
-                  </a:graphicData>
-                </a:graphic>
-                <wp14:sizeRelH relativeFrom="margin">
-                  <wp14:pctWidth>0</wp14:pctWidth>
-                </wp14:sizeRelH>
-                <wp14:sizeRelV relativeFrom="margin">
-                  <wp14:pctHeight>0</wp14:pctHeight>
-                </wp14:sizeRelV>
-              </wp:anchor>
-            </w:drawing>
-          </mc:Choice>
-          <mc:Fallback>
-            <w:pict>
-              <v:shape w14:anchorId="6A484F2C" id="Freeform: Shape 56" o:spid="_x0000_s1026" style="position:absolute;margin-left:55.6pt;margin-top:131.35pt;width:26.85pt;height:58.45pt;z-index:252485120;visibility:visible;mso-wrap-style:square;mso-width-percent:0;mso-height-percent:0;mso-wrap-distance-left:9pt;mso-wrap-distance-top:0;mso-wrap-distance-right:9pt;mso-wrap-distance-bottom:0;mso-position-horizontal:absolute;mso-position-horizontal-relative:text;mso-position-vertical:absolute;mso-position-vertical-relative:text;mso-width-percent:0;mso-height-percent:0;mso-width-relative:margin;mso-height-relative:margin;v-text-anchor:middle" coordsize="559968,829819" o:gfxdata="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" path="m,l,453887r553278,c552181,577412,560971,706294,559874,829819e" filled="f" strokecolor="black [3213]" strokeweight="1.5pt">
-                <v:path arrowok="t" o:connecttype="custom" o:connectlocs="0,0;0,405866;336680,405866;340694,742025" o:connectangles="0,0,0,0"/>
               </v:shape>
             </w:pict>
           </mc:Fallback>
@@ -1613,7 +1613,7 @@
           </mc:Choice>
           <mc:Fallback>
             <w:pict>
-              <v:shape w14:anchorId="14DCD788" id="Freeform: Shape 56" o:spid="_x0000_s1026" style="position:absolute;margin-left:86.05pt;margin-top:152.05pt;width:148.6pt;height:54.45pt;flip:x;z-index:252499456;visibility:visible;mso-wrap-style:square;mso-width-percent:0;mso-height-percent:0;mso-wrap-distance-left:9pt;mso-wrap-distance-top:0;mso-wrap-distance-right:9pt;mso-wrap-distance-bottom:0;mso-position-horizontal:absolute;mso-position-horizontal-relative:text;mso-position-vertical:absolute;mso-position-vertical-relative:text;mso-width-percent:0;mso-height-percent:0;mso-width-relative:margin;mso-height-relative:margin;v-text-anchor:middle" coordsize="553278,453888" o:gfxdata="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" path="m,1l,453888r553278,e" filled="f" strokecolor="black [3213]" strokeweight="1.5pt">
+              <v:shape w14:anchorId="18F363A9" id="Freeform: Shape 56" o:spid="_x0000_s1026" style="position:absolute;margin-left:86.05pt;margin-top:152.05pt;width:148.6pt;height:54.45pt;flip:x;z-index:252499456;visibility:visible;mso-wrap-style:square;mso-width-percent:0;mso-height-percent:0;mso-wrap-distance-left:9pt;mso-wrap-distance-top:0;mso-wrap-distance-right:9pt;mso-wrap-distance-bottom:0;mso-position-horizontal:absolute;mso-position-horizontal-relative:text;mso-position-vertical:absolute;mso-position-vertical-relative:text;mso-width-percent:0;mso-height-percent:0;mso-width-relative:margin;mso-height-relative:margin;v-text-anchor:middle" coordsize="553278,453888" o:gfxdata="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" path="m,1l,453888r553278,e" filled="f" strokecolor="black [3213]" strokeweight="1.5pt">
                 <v:path arrowok="t" o:connecttype="custom" o:connectlocs="0,2;0,691348;1886953,691348" o:connectangles="0,0,0"/>
               </v:shape>
             </w:pict>
@@ -1742,7 +1742,7 @@
           </mc:Choice>
           <mc:Fallback>
             <w:pict>
-              <v:shape w14:anchorId="553B459B" id="Freeform: Shape 56" o:spid="_x0000_s1026" style="position:absolute;margin-left:111.15pt;margin-top:132.15pt;width:70.6pt;height:51.05pt;z-index:252497408;visibility:visible;mso-wrap-style:square;mso-width-percent:0;mso-height-percent:0;mso-wrap-distance-left:9pt;mso-wrap-distance-top:0;mso-wrap-distance-right:9pt;mso-wrap-distance-bottom:0;mso-position-horizontal:absolute;mso-position-horizontal-relative:text;mso-position-vertical:absolute;mso-position-vertical-relative:text;mso-width-percent:0;mso-height-percent:0;mso-width-relative:margin;mso-height-relative:margin;v-text-anchor:middle" coordsize="553278,729950" o:gfxdata="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" path="m,276063l,729950r553278,c551941,577863,548032,152087,546695,e" filled="f" strokecolor="black [3213]" strokeweight="1.5pt">
+              <v:shape w14:anchorId="54AB6D55" id="Freeform: Shape 56" o:spid="_x0000_s1026" style="position:absolute;margin-left:111.15pt;margin-top:132.15pt;width:70.6pt;height:51.05pt;z-index:252497408;visibility:visible;mso-wrap-style:square;mso-width-percent:0;mso-height-percent:0;mso-wrap-distance-left:9pt;mso-wrap-distance-top:0;mso-wrap-distance-right:9pt;mso-wrap-distance-bottom:0;mso-position-horizontal:absolute;mso-position-horizontal-relative:text;mso-position-vertical:absolute;mso-position-vertical-relative:text;mso-width-percent:0;mso-height-percent:0;mso-width-relative:margin;mso-height-relative:margin;v-text-anchor:middle" coordsize="553278,729950" o:gfxdata="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" path="m,276063l,729950r553278,c551941,577863,548032,152087,546695,e" filled="f" strokecolor="black [3213]" strokeweight="1.5pt">
                 <v:path arrowok="t" o:connecttype="custom" o:connectlocs="0,245085;0,648041;896353,648041;885688,0" o:connectangles="0,0,0,0"/>
               </v:shape>
             </w:pict>
@@ -1997,7 +1997,7 @@
           </mc:Choice>
           <mc:Fallback>
             <w:pict>
-              <v:group w14:anchorId="7A327A4B" id="Group 52" o:spid="_x0000_s1026" style="position:absolute;margin-left:180.8pt;margin-top:110.7pt;width:54.75pt;height:43.2pt;z-index:251142656" coordsize="13913,9061" o:gfxdata="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">
+              <v:group w14:anchorId="3B835AE9" id="Group 52" o:spid="_x0000_s1026" style="position:absolute;margin-left:180.8pt;margin-top:110.7pt;width:54.75pt;height:43.2pt;z-index:251142656" coordsize="13913,9061" o:gfxdata="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">
                 <v:shape id="Arc 530914551" o:spid="_x0000_s1027" style="position:absolute;width:3327;height:9061;visibility:visible;mso-wrap-style:square;v-text-anchor:middle" coordsize="332740,906145" o:gfxdata="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" path="m6,456791nsc-190,391601,4781,327063,14582,267585,55661,18282,167820,-76008,253353,66854l166370,453073,6,456791xem6,456791nfc-190,391601,4781,327063,14582,267585,55661,18282,167820,-76008,253353,66854e" filled="f" strokecolor="black [3213]" strokeweight="1.5pt">
                   <v:path arrowok="t" o:connecttype="custom" o:connectlocs="6,456791;14582,267585;253353,66854" o:connectangles="0,0,0"/>
                 </v:shape>
@@ -2094,7 +2094,7 @@
           </mc:Choice>
           <mc:Fallback>
             <w:pict>
-              <v:shapetype w14:anchorId="58C6FC04" id="_x0000_t22" coordsize="21600,21600" o:spt="22" adj="5400" path="m10800,qx0@1l0@2qy10800,21600,21600@2l21600@1qy10800,xem0@1qy10800@0,21600@1nfe">
+              <v:shapetype w14:anchorId="1050E126" id="_x0000_t22" coordsize="21600,21600" o:spt="22" adj="5400" path="m10800,qx0@1l0@2qy10800,21600,21600@2l21600@1qy10800,xem0@1qy10800@0,21600@1nfe">
                 <v:formulas>
                   <v:f eqn="val #0"/>
                   <v:f eqn="prod #0 1 2"/>
@@ -2250,7 +2250,7 @@
           </mc:Choice>
           <mc:Fallback>
             <w:pict>
-              <v:group w14:anchorId="2CBDA133" id="left arc" o:spid="_x0000_s1026" style="position:absolute;margin-left:132.35pt;margin-top:89.6pt;width:20.1pt;height:86.4pt;z-index:252460544;mso-width-relative:margin;mso-height-relative:margin" coordsize="4614,18330" o:gfxdata="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">
+              <v:group w14:anchorId="3572ACD7" id="left arc" o:spid="_x0000_s1026" style="position:absolute;margin-left:132.35pt;margin-top:89.6pt;width:20.1pt;height:86.4pt;z-index:252460544;mso-width-relative:margin;mso-height-relative:margin" coordsize="4614,18330" o:gfxdata="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">
                 <v:shape id="Arc 45" o:spid="_x0000_s1027" style="position:absolute;left:42;width:4572;height:18288;visibility:visible;mso-wrap-style:square;v-text-anchor:middle" coordsize="457200,1828800" o:gfxdata="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" path="m167837,1795906nsc68359,1686193,-410,1323506,2,910750,453,458717,83411,75836,195208,9807r33392,904593l167837,1795906xem167837,1795906nfc68359,1686193,-410,1323506,2,910750,453,458717,83411,75836,195208,9807e" filled="f" strokecolor="white [3212]" strokeweight="4.5pt">
                   <v:path arrowok="t" o:connecttype="custom" o:connectlocs="167837,1795906;2,910750;195208,9807" o:connectangles="0,0,0"/>
                 </v:shape>
@@ -2522,7 +2522,7 @@
           </mc:Choice>
           <mc:Fallback>
             <w:pict>
-              <v:group w14:anchorId="466D0305" id="Group 55" o:spid="_x0000_s1026" style="position:absolute;margin-left:134.3pt;margin-top:90.45pt;width:23.2pt;height:86.4pt;z-index:251851264;mso-width-relative:margin;mso-height-relative:margin" coordsize="2746,10122" o:gfxdata="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">
+              <v:group w14:anchorId="5990B662" id="Group 55" o:spid="_x0000_s1026" style="position:absolute;margin-left:134.3pt;margin-top:90.45pt;width:23.2pt;height:86.4pt;z-index:251851264;mso-width-relative:margin;mso-height-relative:margin" coordsize="2746,10122" o:gfxdata="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">
                 <v:shape id="Arc 45" o:spid="_x0000_s1027" style="position:absolute;width:2528;height:10122;visibility:visible;mso-wrap-style:square;v-text-anchor:middle" coordsize="252834,1012200" o:gfxdata="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" path="m123105,174nsc187213,-6552,242423,179962,251548,434090v1736,48353,1715,97458,-64,145786c241857,841442,183561,1029267,117678,1010989r8739,-504889l123105,174xem123105,174nfc187213,-6552,242423,179962,251548,434090v1736,48353,1715,97458,-64,145786c241857,841442,183561,1029267,117678,1010989e" filled="f" strokecolor="black [3213]" strokeweight="1.25pt">
                   <v:stroke dashstyle="3 1"/>
                   <v:path arrowok="t" o:connecttype="custom" o:connectlocs="123105,174;251548,434090;251484,579876;117678,1010989" o:connectangles="0,0,0,0"/>
@@ -3221,7 +3221,7 @@
           </mc:Choice>
           <mc:Fallback>
             <w:pict>
-              <v:group w14:anchorId="00254511" id="B field" o:spid="_x0000_s1026" style="position:absolute;margin-left:112.05pt;margin-top:97.05pt;width:65.1pt;height:70.05pt;z-index:252398080;mso-width-relative:margin;mso-height-relative:margin" coordsize="13735,14789" o:gfxdata="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">
+              <v:group w14:anchorId="5ED43A06" id="B field" o:spid="_x0000_s1026" style="position:absolute;margin-left:112.05pt;margin-top:97.05pt;width:65.1pt;height:70.05pt;z-index:252398080;mso-width-relative:margin;mso-height-relative:margin" coordsize="13735,14789" o:gfxdata="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">
                 <v:group id="Group 44" o:spid="_x0000_s1027" style="position:absolute;width:13735;height:14789" coordsize="13735,14789" o:gfxdata="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">
                   <v:line id="Straight Connector 1261526302" o:spid="_x0000_s1028" style="position:absolute;visibility:visible;mso-wrap-style:square" from="486,7366" to="12266,7366" o:connectortype="straight" o:gfxdata="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" strokecolor="#00b0f0" strokeweight="1pt"/>
                   <v:shape id="Freeform 32" o:spid="_x0000_s1029" style="position:absolute;left:804;top:3323;width:11519;height:2495;visibility:visible;mso-wrap-style:square;v-text-anchor:middle" coordsize="1152226,348710" o:gfxdata="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" path="m,324084c176661,161774,394498,-4030,586536,74v192038,4104,448445,270744,565690,348636e" filled="f" strokecolor="#00b0f0" strokeweight="1pt">
@@ -3333,7 +3333,7 @@
           </mc:Choice>
           <mc:Fallback>
             <w:pict>
-              <v:shape w14:anchorId="2136E429" id="Can 3" o:spid="_x0000_s1026" type="#_x0000_t22" style="position:absolute;margin-left:63.1pt;margin-top:96.15pt;width:37.05pt;height:1in;rotation:90;z-index:251002368;visibility:visible;mso-wrap-style:square;mso-wrap-distance-left:9pt;mso-wrap-distance-top:0;mso-wrap-distance-right:9pt;mso-wrap-distance-bottom:0;mso-position-horizontal:absolute;mso-position-horizontal-relative:text;mso-position-vertical:absolute;mso-position-vertical-relative:text;v-text-anchor:middle" o:gfxdata="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" adj="2779" fillcolor="#bfbfbf [2412]" strokecolor="black [3213]"/>
+              <v:shape w14:anchorId="664CA1FF" id="Can 3" o:spid="_x0000_s1026" type="#_x0000_t22" style="position:absolute;margin-left:63.1pt;margin-top:96.15pt;width:37.05pt;height:1in;rotation:90;z-index:251002368;visibility:visible;mso-wrap-style:square;mso-wrap-distance-left:9pt;mso-wrap-distance-top:0;mso-wrap-distance-right:9pt;mso-wrap-distance-bottom:0;mso-position-horizontal:absolute;mso-position-horizontal-relative:text;mso-position-vertical:absolute;mso-position-vertical-relative:text;v-text-anchor:middle" o:gfxdata="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" adj="2779" fillcolor="#bfbfbf [2412]" strokecolor="black [3213]"/>
             </w:pict>
           </mc:Fallback>
         </mc:AlternateContent>
@@ -3586,7 +3586,7 @@
           </mc:Choice>
           <mc:Fallback>
             <w:pict>
-              <v:group w14:anchorId="08CCEC37" id="Group 51" o:spid="_x0000_s1026" style="position:absolute;margin-left:55.75pt;margin-top:110.35pt;width:55pt;height:43.2pt;z-index:251017728" coordsize="13968,9061" o:gfxdata="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">
+              <v:group w14:anchorId="79A2C993" id="Group 51" o:spid="_x0000_s1026" style="position:absolute;margin-left:55.75pt;margin-top:110.35pt;width:55pt;height:43.2pt;z-index:251017728" coordsize="13968,9061" o:gfxdata="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">
                 <v:shape id="Arc 974807544" o:spid="_x0000_s1027" style="position:absolute;width:3327;height:9061;visibility:visible;mso-wrap-style:square;v-text-anchor:middle" coordsize="332740,906145" o:gfxdata="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" path="m6,456791nsc-190,391601,4781,327063,14582,267585,55661,18282,167820,-76008,253353,66854l166370,453073,6,456791xem6,456791nfc-190,391601,4781,327063,14582,267585,55661,18282,167820,-76008,253353,66854e" filled="f" strokecolor="black [3213]" strokeweight="1.5pt">
                   <v:path arrowok="t" o:connecttype="custom" o:connectlocs="6,456791;14582,267585;253353,66854" o:connectangles="0,0,0"/>
                 </v:shape>

</xml_diff>